<commit_message>
Competed the 3rd iteration
The new function related to iteration 3 is 'txtserch_Navigate' and it includes all the 4 user stories of this iteration
</commit_message>
<xml_diff>
--- a/UserStoriesNplan.docx
+++ b/UserStoriesNplan.docx
@@ -330,7 +330,29 @@
           <w:szCs w:val="22"/>
           <w14:ligatures w14:val="none"/>
         </w:rPr>
-        <w:t>US1.3 — Clean &amp; Normalize Text: As a user, I want the system to remove artifacts so the text is ready for summarization.</w:t>
+        <w:t xml:space="preserve">US1.3 — Clean &amp; Normalize Text: As a user, I want the system to remove </w:t>
+      </w:r>
+      <w:proofErr w:type="gramStart"/>
+      <w:r>
+        <w:rPr>
+          <w:rFonts w:eastAsiaTheme="minorEastAsia"/>
+          <w:kern w:val="0"/>
+          <w:sz w:val="22"/>
+          <w:szCs w:val="22"/>
+          <w14:ligatures w14:val="none"/>
+        </w:rPr>
+        <w:t>artifacts</w:t>
+      </w:r>
+      <w:proofErr w:type="gramEnd"/>
+      <w:r>
+        <w:rPr>
+          <w:rFonts w:eastAsiaTheme="minorEastAsia"/>
+          <w:kern w:val="0"/>
+          <w:sz w:val="22"/>
+          <w:szCs w:val="22"/>
+          <w14:ligatures w14:val="none"/>
+        </w:rPr>
+        <w:t xml:space="preserve"> so the text is ready for summarization.</w:t>
       </w:r>
     </w:p>
     <w:p>
@@ -1645,34 +1667,78 @@
           <w:szCs w:val="22"/>
           <w14:ligatures w14:val="none"/>
         </w:rPr>
-        <w:t>US5.2 — Q&amp;A Mode: As a user, I want to ask questions and get direct answers so I don’t have to read the whole document.</w:t>
-      </w:r>
-    </w:p>
-    <w:p>
-      <w:pPr>
-        <w:tabs>
-          <w:tab w:val="num" w:pos="360"/>
-        </w:tabs>
-        <w:spacing w:after="200" w:line="276" w:lineRule="auto"/>
-        <w:ind w:left="360" w:hanging="360"/>
-        <w:contextualSpacing/>
-        <w:rPr>
-          <w:rFonts w:eastAsiaTheme="minorEastAsia"/>
-          <w:kern w:val="0"/>
-          <w:sz w:val="22"/>
-          <w:szCs w:val="22"/>
-          <w14:ligatures w14:val="none"/>
-        </w:rPr>
-      </w:pPr>
-      <w:r>
-        <w:rPr>
-          <w:rFonts w:eastAsiaTheme="minorEastAsia"/>
-          <w:kern w:val="0"/>
-          <w:sz w:val="22"/>
-          <w:szCs w:val="22"/>
-          <w14:ligatures w14:val="none"/>
-        </w:rPr>
-        <w:t>US5.3 — Cross-Linking Between Features: As a user, I want search results, summaries, and outline items to link to each other for seamless navigation.</w:t>
+        <w:t xml:space="preserve">US5.2 — Q&amp;A Mode: As a user, I want to ask questions and get direct </w:t>
+      </w:r>
+      <w:proofErr w:type="gramStart"/>
+      <w:r>
+        <w:rPr>
+          <w:rFonts w:eastAsiaTheme="minorEastAsia"/>
+          <w:kern w:val="0"/>
+          <w:sz w:val="22"/>
+          <w:szCs w:val="22"/>
+          <w14:ligatures w14:val="none"/>
+        </w:rPr>
+        <w:t>answers</w:t>
+      </w:r>
+      <w:proofErr w:type="gramEnd"/>
+      <w:r>
+        <w:rPr>
+          <w:rFonts w:eastAsiaTheme="minorEastAsia"/>
+          <w:kern w:val="0"/>
+          <w:sz w:val="22"/>
+          <w:szCs w:val="22"/>
+          <w14:ligatures w14:val="none"/>
+        </w:rPr>
+        <w:t xml:space="preserve"> so I don’t have to read the whole document.</w:t>
+      </w:r>
+    </w:p>
+    <w:p>
+      <w:pPr>
+        <w:tabs>
+          <w:tab w:val="num" w:pos="360"/>
+        </w:tabs>
+        <w:spacing w:after="200" w:line="276" w:lineRule="auto"/>
+        <w:ind w:left="360" w:hanging="360"/>
+        <w:contextualSpacing/>
+        <w:rPr>
+          <w:rFonts w:eastAsiaTheme="minorEastAsia"/>
+          <w:kern w:val="0"/>
+          <w:sz w:val="22"/>
+          <w:szCs w:val="22"/>
+          <w14:ligatures w14:val="none"/>
+        </w:rPr>
+      </w:pPr>
+      <w:r>
+        <w:rPr>
+          <w:rFonts w:eastAsiaTheme="minorEastAsia"/>
+          <w:kern w:val="0"/>
+          <w:sz w:val="22"/>
+          <w:szCs w:val="22"/>
+          <w14:ligatures w14:val="none"/>
+        </w:rPr>
+        <w:t xml:space="preserve">US5.3 — Cross-Linking Between Features: As a user, I want </w:t>
+      </w:r>
+      <w:proofErr w:type="gramStart"/>
+      <w:r>
+        <w:rPr>
+          <w:rFonts w:eastAsiaTheme="minorEastAsia"/>
+          <w:kern w:val="0"/>
+          <w:sz w:val="22"/>
+          <w:szCs w:val="22"/>
+          <w14:ligatures w14:val="none"/>
+        </w:rPr>
+        <w:t>search</w:t>
+      </w:r>
+      <w:proofErr w:type="gramEnd"/>
+      <w:r>
+        <w:rPr>
+          <w:rFonts w:eastAsiaTheme="minorEastAsia"/>
+          <w:kern w:val="0"/>
+          <w:sz w:val="22"/>
+          <w:szCs w:val="22"/>
+          <w14:ligatures w14:val="none"/>
+        </w:rPr>
+        <w:t xml:space="preserve"> results, summaries, and outline items to link to each other for seamless navigation.</w:t>
       </w:r>
     </w:p>
     <w:p>
@@ -1980,7 +2046,29 @@
           <w:szCs w:val="22"/>
           <w14:ligatures w14:val="none"/>
         </w:rPr>
-        <w:t>US6.2 — Error Handling &amp; Recovery: As a user, I want clear error messages so I understand what went wrong.</w:t>
+        <w:t xml:space="preserve">US6.2 — Error Handling &amp; Recovery: As a user, I want clear error </w:t>
+      </w:r>
+      <w:proofErr w:type="gramStart"/>
+      <w:r>
+        <w:rPr>
+          <w:rFonts w:eastAsiaTheme="minorEastAsia"/>
+          <w:kern w:val="0"/>
+          <w:sz w:val="22"/>
+          <w:szCs w:val="22"/>
+          <w14:ligatures w14:val="none"/>
+        </w:rPr>
+        <w:t>messages</w:t>
+      </w:r>
+      <w:proofErr w:type="gramEnd"/>
+      <w:r>
+        <w:rPr>
+          <w:rFonts w:eastAsiaTheme="minorEastAsia"/>
+          <w:kern w:val="0"/>
+          <w:sz w:val="22"/>
+          <w:szCs w:val="22"/>
+          <w14:ligatures w14:val="none"/>
+        </w:rPr>
+        <w:t xml:space="preserve"> so I understand what went wrong.</w:t>
       </w:r>
     </w:p>
     <w:p>

</xml_diff>

<commit_message>
Adding Q&A module to iteration 5
</commit_message>
<xml_diff>
--- a/UserStoriesNplan.docx
+++ b/UserStoriesNplan.docx
@@ -330,29 +330,7 @@
           <w:szCs w:val="22"/>
           <w14:ligatures w14:val="none"/>
         </w:rPr>
-        <w:t xml:space="preserve">US1.3 — Clean &amp; Normalize Text: As a user, I want the system to remove </w:t>
-      </w:r>
-      <w:proofErr w:type="gramStart"/>
-      <w:r>
-        <w:rPr>
-          <w:rFonts w:eastAsiaTheme="minorEastAsia"/>
-          <w:kern w:val="0"/>
-          <w:sz w:val="22"/>
-          <w:szCs w:val="22"/>
-          <w14:ligatures w14:val="none"/>
-        </w:rPr>
-        <w:t>artifacts</w:t>
-      </w:r>
-      <w:proofErr w:type="gramEnd"/>
-      <w:r>
-        <w:rPr>
-          <w:rFonts w:eastAsiaTheme="minorEastAsia"/>
-          <w:kern w:val="0"/>
-          <w:sz w:val="22"/>
-          <w:szCs w:val="22"/>
-          <w14:ligatures w14:val="none"/>
-        </w:rPr>
-        <w:t xml:space="preserve"> so the text is ready for summarization.</w:t>
+        <w:t>US1.3 — Clean &amp; Normalize Text: As a user, I want the system to remove artifacts so the text is ready for summarization.</w:t>
       </w:r>
     </w:p>
     <w:p>
@@ -1667,78 +1645,34 @@
           <w:szCs w:val="22"/>
           <w14:ligatures w14:val="none"/>
         </w:rPr>
-        <w:t xml:space="preserve">US5.2 — Q&amp;A Mode: As a user, I want to ask questions and get direct </w:t>
-      </w:r>
-      <w:proofErr w:type="gramStart"/>
-      <w:r>
-        <w:rPr>
-          <w:rFonts w:eastAsiaTheme="minorEastAsia"/>
-          <w:kern w:val="0"/>
-          <w:sz w:val="22"/>
-          <w:szCs w:val="22"/>
-          <w14:ligatures w14:val="none"/>
-        </w:rPr>
-        <w:t>answers</w:t>
-      </w:r>
-      <w:proofErr w:type="gramEnd"/>
-      <w:r>
-        <w:rPr>
-          <w:rFonts w:eastAsiaTheme="minorEastAsia"/>
-          <w:kern w:val="0"/>
-          <w:sz w:val="22"/>
-          <w:szCs w:val="22"/>
-          <w14:ligatures w14:val="none"/>
-        </w:rPr>
-        <w:t xml:space="preserve"> so I don’t have to read the whole document.</w:t>
-      </w:r>
-    </w:p>
-    <w:p>
-      <w:pPr>
-        <w:tabs>
-          <w:tab w:val="num" w:pos="360"/>
-        </w:tabs>
-        <w:spacing w:after="200" w:line="276" w:lineRule="auto"/>
-        <w:ind w:left="360" w:hanging="360"/>
-        <w:contextualSpacing/>
-        <w:rPr>
-          <w:rFonts w:eastAsiaTheme="minorEastAsia"/>
-          <w:kern w:val="0"/>
-          <w:sz w:val="22"/>
-          <w:szCs w:val="22"/>
-          <w14:ligatures w14:val="none"/>
-        </w:rPr>
-      </w:pPr>
-      <w:r>
-        <w:rPr>
-          <w:rFonts w:eastAsiaTheme="minorEastAsia"/>
-          <w:kern w:val="0"/>
-          <w:sz w:val="22"/>
-          <w:szCs w:val="22"/>
-          <w14:ligatures w14:val="none"/>
-        </w:rPr>
-        <w:t xml:space="preserve">US5.3 — Cross-Linking Between Features: As a user, I want </w:t>
-      </w:r>
-      <w:proofErr w:type="gramStart"/>
-      <w:r>
-        <w:rPr>
-          <w:rFonts w:eastAsiaTheme="minorEastAsia"/>
-          <w:kern w:val="0"/>
-          <w:sz w:val="22"/>
-          <w:szCs w:val="22"/>
-          <w14:ligatures w14:val="none"/>
-        </w:rPr>
-        <w:t>search</w:t>
-      </w:r>
-      <w:proofErr w:type="gramEnd"/>
-      <w:r>
-        <w:rPr>
-          <w:rFonts w:eastAsiaTheme="minorEastAsia"/>
-          <w:kern w:val="0"/>
-          <w:sz w:val="22"/>
-          <w:szCs w:val="22"/>
-          <w14:ligatures w14:val="none"/>
-        </w:rPr>
-        <w:t xml:space="preserve"> results, summaries, and outline items to link to each other for seamless navigation.</w:t>
+        <w:t>US5.2 — Q&amp;A Mode: As a user, I want to ask questions and get direct answers so I don’t have to read the whole document.</w:t>
+      </w:r>
+    </w:p>
+    <w:p>
+      <w:pPr>
+        <w:tabs>
+          <w:tab w:val="num" w:pos="360"/>
+        </w:tabs>
+        <w:spacing w:after="200" w:line="276" w:lineRule="auto"/>
+        <w:ind w:left="360" w:hanging="360"/>
+        <w:contextualSpacing/>
+        <w:rPr>
+          <w:rFonts w:eastAsiaTheme="minorEastAsia"/>
+          <w:kern w:val="0"/>
+          <w:sz w:val="22"/>
+          <w:szCs w:val="22"/>
+          <w14:ligatures w14:val="none"/>
+        </w:rPr>
+      </w:pPr>
+      <w:r>
+        <w:rPr>
+          <w:rFonts w:eastAsiaTheme="minorEastAsia"/>
+          <w:kern w:val="0"/>
+          <w:sz w:val="22"/>
+          <w:szCs w:val="22"/>
+          <w14:ligatures w14:val="none"/>
+        </w:rPr>
+        <w:t>US5.3 — Cross-Linking Between Features: As a user, I want search results, summaries, and outline items to link to each other for seamless navigation.</w:t>
       </w:r>
     </w:p>
     <w:p>
@@ -2046,29 +1980,7 @@
           <w:szCs w:val="22"/>
           <w14:ligatures w14:val="none"/>
         </w:rPr>
-        <w:t xml:space="preserve">US6.2 — Error Handling &amp; Recovery: As a user, I want clear error </w:t>
-      </w:r>
-      <w:proofErr w:type="gramStart"/>
-      <w:r>
-        <w:rPr>
-          <w:rFonts w:eastAsiaTheme="minorEastAsia"/>
-          <w:kern w:val="0"/>
-          <w:sz w:val="22"/>
-          <w:szCs w:val="22"/>
-          <w14:ligatures w14:val="none"/>
-        </w:rPr>
-        <w:t>messages</w:t>
-      </w:r>
-      <w:proofErr w:type="gramEnd"/>
-      <w:r>
-        <w:rPr>
-          <w:rFonts w:eastAsiaTheme="minorEastAsia"/>
-          <w:kern w:val="0"/>
-          <w:sz w:val="22"/>
-          <w:szCs w:val="22"/>
-          <w14:ligatures w14:val="none"/>
-        </w:rPr>
-        <w:t xml:space="preserve"> so I understand what went wrong.</w:t>
+        <w:t>US6.2 — Error Handling &amp; Recovery: As a user, I want clear error messages so I understand what went wrong.</w:t>
       </w:r>
     </w:p>
     <w:p>

</xml_diff>

<commit_message>
E nd of Iteration 5 (All the project code files)
The core functions are in Python while the user interface are in HTML. Some HTML files show a web presentation of the Ui page.
</commit_message>
<xml_diff>
--- a/UserStoriesNplan.docx
+++ b/UserStoriesNplan.docx
@@ -330,7 +330,29 @@
           <w:szCs w:val="22"/>
           <w14:ligatures w14:val="none"/>
         </w:rPr>
-        <w:t>US1.3 — Clean &amp; Normalize Text: As a user, I want the system to remove artifacts so the text is ready for summarization.</w:t>
+        <w:t xml:space="preserve">US1.3 — Clean &amp; Normalize Text: As a user, I want the system to remove </w:t>
+      </w:r>
+      <w:proofErr w:type="gramStart"/>
+      <w:r>
+        <w:rPr>
+          <w:rFonts w:eastAsiaTheme="minorEastAsia"/>
+          <w:kern w:val="0"/>
+          <w:sz w:val="22"/>
+          <w:szCs w:val="22"/>
+          <w14:ligatures w14:val="none"/>
+        </w:rPr>
+        <w:t>artifacts</w:t>
+      </w:r>
+      <w:proofErr w:type="gramEnd"/>
+      <w:r>
+        <w:rPr>
+          <w:rFonts w:eastAsiaTheme="minorEastAsia"/>
+          <w:kern w:val="0"/>
+          <w:sz w:val="22"/>
+          <w:szCs w:val="22"/>
+          <w14:ligatures w14:val="none"/>
+        </w:rPr>
+        <w:t xml:space="preserve"> so the text is ready for summarization.</w:t>
       </w:r>
     </w:p>
     <w:p>
@@ -1645,34 +1667,78 @@
           <w:szCs w:val="22"/>
           <w14:ligatures w14:val="none"/>
         </w:rPr>
-        <w:t>US5.2 — Q&amp;A Mode: As a user, I want to ask questions and get direct answers so I don’t have to read the whole document.</w:t>
-      </w:r>
-    </w:p>
-    <w:p>
-      <w:pPr>
-        <w:tabs>
-          <w:tab w:val="num" w:pos="360"/>
-        </w:tabs>
-        <w:spacing w:after="200" w:line="276" w:lineRule="auto"/>
-        <w:ind w:left="360" w:hanging="360"/>
-        <w:contextualSpacing/>
-        <w:rPr>
-          <w:rFonts w:eastAsiaTheme="minorEastAsia"/>
-          <w:kern w:val="0"/>
-          <w:sz w:val="22"/>
-          <w:szCs w:val="22"/>
-          <w14:ligatures w14:val="none"/>
-        </w:rPr>
-      </w:pPr>
-      <w:r>
-        <w:rPr>
-          <w:rFonts w:eastAsiaTheme="minorEastAsia"/>
-          <w:kern w:val="0"/>
-          <w:sz w:val="22"/>
-          <w:szCs w:val="22"/>
-          <w14:ligatures w14:val="none"/>
-        </w:rPr>
-        <w:t>US5.3 — Cross-Linking Between Features: As a user, I want search results, summaries, and outline items to link to each other for seamless navigation.</w:t>
+        <w:t xml:space="preserve">US5.2 — Q&amp;A Mode: As a user, I want to ask questions and get direct </w:t>
+      </w:r>
+      <w:proofErr w:type="gramStart"/>
+      <w:r>
+        <w:rPr>
+          <w:rFonts w:eastAsiaTheme="minorEastAsia"/>
+          <w:kern w:val="0"/>
+          <w:sz w:val="22"/>
+          <w:szCs w:val="22"/>
+          <w14:ligatures w14:val="none"/>
+        </w:rPr>
+        <w:t>answers</w:t>
+      </w:r>
+      <w:proofErr w:type="gramEnd"/>
+      <w:r>
+        <w:rPr>
+          <w:rFonts w:eastAsiaTheme="minorEastAsia"/>
+          <w:kern w:val="0"/>
+          <w:sz w:val="22"/>
+          <w:szCs w:val="22"/>
+          <w14:ligatures w14:val="none"/>
+        </w:rPr>
+        <w:t xml:space="preserve"> so I don’t have to read the whole document.</w:t>
+      </w:r>
+    </w:p>
+    <w:p>
+      <w:pPr>
+        <w:tabs>
+          <w:tab w:val="num" w:pos="360"/>
+        </w:tabs>
+        <w:spacing w:after="200" w:line="276" w:lineRule="auto"/>
+        <w:ind w:left="360" w:hanging="360"/>
+        <w:contextualSpacing/>
+        <w:rPr>
+          <w:rFonts w:eastAsiaTheme="minorEastAsia"/>
+          <w:kern w:val="0"/>
+          <w:sz w:val="22"/>
+          <w:szCs w:val="22"/>
+          <w14:ligatures w14:val="none"/>
+        </w:rPr>
+      </w:pPr>
+      <w:r>
+        <w:rPr>
+          <w:rFonts w:eastAsiaTheme="minorEastAsia"/>
+          <w:kern w:val="0"/>
+          <w:sz w:val="22"/>
+          <w:szCs w:val="22"/>
+          <w14:ligatures w14:val="none"/>
+        </w:rPr>
+        <w:t xml:space="preserve">US5.3 — Cross-Linking Between Features: As a user, I want </w:t>
+      </w:r>
+      <w:proofErr w:type="gramStart"/>
+      <w:r>
+        <w:rPr>
+          <w:rFonts w:eastAsiaTheme="minorEastAsia"/>
+          <w:kern w:val="0"/>
+          <w:sz w:val="22"/>
+          <w:szCs w:val="22"/>
+          <w14:ligatures w14:val="none"/>
+        </w:rPr>
+        <w:t>search</w:t>
+      </w:r>
+      <w:proofErr w:type="gramEnd"/>
+      <w:r>
+        <w:rPr>
+          <w:rFonts w:eastAsiaTheme="minorEastAsia"/>
+          <w:kern w:val="0"/>
+          <w:sz w:val="22"/>
+          <w:szCs w:val="22"/>
+          <w14:ligatures w14:val="none"/>
+        </w:rPr>
+        <w:t xml:space="preserve"> results, summaries, and outline items to link to each other for seamless navigation.</w:t>
       </w:r>
     </w:p>
     <w:p>
@@ -1980,7 +2046,29 @@
           <w:szCs w:val="22"/>
           <w14:ligatures w14:val="none"/>
         </w:rPr>
-        <w:t>US6.2 — Error Handling &amp; Recovery: As a user, I want clear error messages so I understand what went wrong.</w:t>
+        <w:t xml:space="preserve">US6.2 — Error Handling &amp; Recovery: As a user, I want clear error </w:t>
+      </w:r>
+      <w:proofErr w:type="gramStart"/>
+      <w:r>
+        <w:rPr>
+          <w:rFonts w:eastAsiaTheme="minorEastAsia"/>
+          <w:kern w:val="0"/>
+          <w:sz w:val="22"/>
+          <w:szCs w:val="22"/>
+          <w14:ligatures w14:val="none"/>
+        </w:rPr>
+        <w:t>messages</w:t>
+      </w:r>
+      <w:proofErr w:type="gramEnd"/>
+      <w:r>
+        <w:rPr>
+          <w:rFonts w:eastAsiaTheme="minorEastAsia"/>
+          <w:kern w:val="0"/>
+          <w:sz w:val="22"/>
+          <w:szCs w:val="22"/>
+          <w14:ligatures w14:val="none"/>
+        </w:rPr>
+        <w:t xml:space="preserve"> so I understand what went wrong.</w:t>
       </w:r>
     </w:p>
     <w:p>

</xml_diff>